<commit_message>
New ZSight documents related to Geolocation and Missed Pickup Logic
</commit_message>
<xml_diff>
--- a/2026/ZSIGHT/Geolocation Reference Logic/DigDev_ZSight_Geolocation_Logic_FDD_v1.1.docx
+++ b/2026/ZSIGHT/Geolocation Reference Logic/DigDev_ZSight_Geolocation_Logic_FDD_v1.1.docx
@@ -2994,7 +2994,7 @@
                 <w:sz w:val="20"/>
                 <w:szCs w:val="20"/>
               </w:rPr>
-              <w:t>05</w:t>
+              <w:t>14</w:t>
             </w:r>
             <w:r>
               <w:rPr>
@@ -3098,7 +3098,7 @@
                 <w:sz w:val="20"/>
                 <w:szCs w:val="20"/>
               </w:rPr>
-              <w:t>03</w:t>
+              <w:t>18</w:t>
             </w:r>
             <w:r>
               <w:rPr>
@@ -3257,7 +3257,7 @@
                 <w:sz w:val="20"/>
                 <w:szCs w:val="20"/>
               </w:rPr>
-              <w:t>05</w:t>
+              <w:t>18</w:t>
             </w:r>
             <w:r>
               <w:rPr>
@@ -3880,7 +3880,14 @@
                 <w:sz w:val="20"/>
                 <w:szCs w:val="20"/>
               </w:rPr>
-              <w:t>10</w:t>
+              <w:t>1</w:t>
+            </w:r>
+            <w:r>
+              <w:rPr>
+                <w:sz w:val="20"/>
+                <w:szCs w:val="20"/>
+              </w:rPr>
+              <w:t>4</w:t>
             </w:r>
             <w:r>
               <w:rPr>
@@ -8353,7 +8360,7 @@
           <w:noProof/>
         </w:rPr>
         <w:drawing>
-          <wp:anchor distT="0" distB="0" distL="114300" distR="114300" simplePos="0" relativeHeight="251658240" behindDoc="0" locked="0" layoutInCell="1" allowOverlap="1" wp14:anchorId="732542F1" wp14:editId="37EE3771">
+          <wp:anchor distT="0" distB="0" distL="114300" distR="114300" simplePos="0" relativeHeight="251658240" behindDoc="0" locked="0" layoutInCell="1" allowOverlap="1" wp14:anchorId="732542F1" wp14:editId="51FD6B3A">
             <wp:simplePos x="0" y="0"/>
             <wp:positionH relativeFrom="column">
               <wp:posOffset>5119480</wp:posOffset>
@@ -10653,21 +10660,7 @@
                 <w:sz w:val="20"/>
                 <w:szCs w:val="20"/>
               </w:rPr>
-              <w:t xml:space="preserve">Installed and </w:t>
-            </w:r>
-            <w:r>
-              <w:rPr>
-                <w:sz w:val="20"/>
-                <w:szCs w:val="20"/>
-              </w:rPr>
-              <w:t>transmitted</w:t>
-            </w:r>
-            <w:r>
-              <w:rPr>
-                <w:sz w:val="20"/>
-                <w:szCs w:val="20"/>
-              </w:rPr>
-              <w:t>. Ref 1 arrives in the feed.</w:t>
+              <w:t>Installed and transmitted. Ref 1 arrives in the feed.</w:t>
             </w:r>
           </w:p>
         </w:tc>
@@ -11423,13 +11416,7 @@
       </w:r>
       <w:proofErr w:type="gramEnd"/>
       <w:r>
-        <w:t xml:space="preserve"> at least once, the Container Location </w:t>
-      </w:r>
-      <w:r>
-        <w:t>is always resolved</w:t>
-      </w:r>
-      <w:r>
-        <w:t>. In parallel, the Reference Point is resolved by the rule defined in section 3.2.3: the Manual Geo Location where its override status is active, otherwise the Site Location.</w:t>
+        <w:t xml:space="preserve"> at least once, the Container Location is always resolved. In parallel, the Reference Point is resolved by the rule defined in section 3.2.3: the Manual Geo Location where its override status is active, otherwise the Site Location.</w:t>
       </w:r>
     </w:p>
     <w:p>
@@ -12751,13 +12738,7 @@
     </w:p>
     <w:p>
       <w:r>
-        <w:t>The override remains active until a user sets the Status toggle back to inactive. It is never removed automatically. Setting the Status toggle to active applies whatever values are currently held in the Latitude and Longitude fields</w:t>
-      </w:r>
-      <w:r>
-        <w:t xml:space="preserve">, </w:t>
-      </w:r>
-      <w:r>
-        <w:t>verify the coordinates before activating. Deactivating the override and saving returns the Reference Point to the Site Location on the next report; the coordinates remain in the fields but are not applied.</w:t>
+        <w:t>The override remains active until a user sets the Status toggle back to inactive. It is never removed automatically. Setting the Status toggle to active applies whatever values are currently held in the Latitude and Longitude fields, verify the coordinates before activating. Deactivating the override and saving returns the Reference Point to the Site Location on the next report; the coordinates remain in the fields but are not applied.</w:t>
       </w:r>
     </w:p>
     <w:tbl>

</xml_diff>